<commit_message>
docs: LLM 산출물(PPT/Word)에 Structured Output 기능 반영
- pptx 슬라이드 33 부록 표: LLM 진단 보고서 역할에 Structured Output 설명 추가
- docx 부록 M.2 표: 출력 형식(Structured Output) 행 신규 추가
  (status/anomalies/action/similar_case_note/doc_basis 필드 설명)
</commit_message>
<xml_diff>
--- a/Homework/LLM_FactoryAutomation/산출물/허남_LLM프로젝트.docx
+++ b/Homework/LLM_FactoryAutomation/산출물/허남_LLM프로젝트.docx
@@ -20061,6 +20061,28 @@
           <w:p>
             <w:r>
               <w:t>generate_report_mock() — ANTHROPIC_API_KEY 미설정 시 규칙 기반으로 동일 5섹션 구조의 보고서를 생성, API 키 없이도 데모/시연이 가능</w:t>
+            </w:r>
+          </w:p>
+        </w:tc>
+      </w:tr>
+      <w:tr>
+        <w:tc>
+          <w:tcPr>
+            <w:tcW w:type="dxa" w:w="4703"/>
+          </w:tcPr>
+          <w:p>
+            <w:r>
+              <w:t>출력 형식 (Structured Output)</w:t>
+            </w:r>
+          </w:p>
+        </w:tc>
+        <w:tc>
+          <w:tcPr>
+            <w:tcW w:type="dxa" w:w="4703"/>
+          </w:tcPr>
+          <w:p>
+            <w:r>
+              <w:t>자유 텍스트(5섹션 보고서)에 더해 JSON Schema로 강제된 정형 출력을 추가 지원 (generate_report_structured() / generate_report_structured_mock(), output_config={format: json_schema}). 반환 필드: status(정상/주의/위험)·anomalies·action(urgency/description)·similar_case_note·doc_basis — 파싱 없이 대시보드 배지 표시·알람 연동·DB 저장에 바로 활용 가능</w:t>
             </w:r>
           </w:p>
         </w:tc>

</xml_diff>

<commit_message>
fix: RAG(femto_doc_rag) LLM temperature 0.3으로 낮춰 사실 기반 답변 강화
- 사실 근거 문서 기반 답변이 중요한 RAG 특성상 temperature를 0.5 미만(0.3)으로 설정
- pptx 슬라이드 33 표, docx 부록 M.1 표에 생성 파라미터 변경사항 반영
</commit_message>
<xml_diff>
--- a/Homework/LLM_FactoryAutomation/산출물/허남_LLM프로젝트.docx
+++ b/Homework/LLM_FactoryAutomation/산출물/허남_LLM프로젝트.docx
@@ -19860,6 +19860,38 @@
           <w:p>
             <w:r>
               <w:t>정비 조치 근거 문서 인용</w:t>
+            </w:r>
+          </w:p>
+        </w:tc>
+      </w:tr>
+      <w:tr>
+        <w:tc>
+          <w:tcPr>
+            <w:tcW w:type="dxa" w:w="3135"/>
+          </w:tcPr>
+          <w:p>
+            <w:r>
+              <w:t>생성 파라미터</w:t>
+            </w:r>
+          </w:p>
+        </w:tc>
+        <w:tc>
+          <w:tcPr>
+            <w:tcW w:type="dxa" w:w="3135"/>
+          </w:tcPr>
+          <w:p>
+            <w:r>
+              <w:t>해당 없음 (LLM 미사용, 벡터 유사도 검색만 수행)</w:t>
+            </w:r>
+          </w:p>
+        </w:tc>
+        <w:tc>
+          <w:tcPr>
+            <w:tcW w:type="dxa" w:w="3135"/>
+          </w:tcPr>
+          <w:p>
+            <w:r>
+              <w:t>Ollama temperature=0.3 — 사실 기반 답변이 필요한 RAG 특성상 0.5 미만으로 낮게 설정</w:t>
             </w:r>
           </w:p>
         </w:tc>

</xml_diff>

<commit_message>
docs: RAG 종류(일반/Hybrid/Graph/Advanced) 분류 및 Ollama Cloud 제약 문서화
- docx M.1 표·pptx 로드맵 슬라이드에 RAG 종류 분류(현재는 일반 RAG) +
  Hybrid/Graph RAG 적용 가능성 반영
- 배포 가이드에 Ollama Cloud 연결 불가 사유와 Claude API 폴백 대안 명시
</commit_message>
<xml_diff>
--- a/Homework/LLM_FactoryAutomation/산출물/허남_LLM프로젝트.docx
+++ b/Homework/LLM_FactoryAutomation/산출물/허남_LLM프로젝트.docx
@@ -19892,6 +19892,38 @@
           <w:p>
             <w:r>
               <w:t>Ollama temperature=0.0 — 사실 기반 답변만 해야 하는 RAG 특성상 결정론적 출력으로 설정</w:t>
+            </w:r>
+          </w:p>
+        </w:tc>
+      </w:tr>
+      <w:tr>
+        <w:tc>
+          <w:tcPr>
+            <w:tcW w:type="dxa" w:w="3135"/>
+          </w:tcPr>
+          <w:p>
+            <w:r>
+              <w:t>RAG 종류</w:t>
+            </w:r>
+          </w:p>
+        </w:tc>
+        <w:tc>
+          <w:tcPr>
+            <w:tcW w:type="dxa" w:w="3135"/>
+          </w:tcPr>
+          <w:p>
+            <w:r>
+              <w:t>일반 RAG (순수 벡터 검색, FAISS 코사인 유사도)</w:t>
+            </w:r>
+          </w:p>
+        </w:tc>
+        <w:tc>
+          <w:tcPr>
+            <w:tcW w:type="dxa" w:w="3135"/>
+          </w:tcPr>
+          <w:p>
+            <w:r>
+              <w:t>일반 RAG (순수 벡터 검색, Chroma + LangChain 체인)</w:t>
             </w:r>
           </w:p>
         </w:tc>

</xml_diff>

<commit_message>
feat: RAG-Level2에 Hybrid RAG(BM25+벡터) 적용
- retrieve_docs()/ask()에 use_hybrid(기본 True) 옵션 추가 -
  BM25Retriever + Chroma 벡터 검색을 EnsembleRetriever로 50:50 결합
- rank_bm25 의존성 추가, EnsembleRetriever는 langchain_classic(신버전)/
  langchain(구버전) 양쪽 호환되도록 try/except import
- 검증: "온도만 상승하면 어떻게 해야 하나요?" 질의가 적용 전
  "문서에서 찾을 수 없습니다" -> 적용 후 윤활 점검 근거를 정확히 찾아
  답변하도록 개선 확인(CLI 실행 결과로 확인)
- PPT/Word 로드맵 표·RAG 종류 항목을 "완료(v0.6)"로 갱신
</commit_message>
<xml_diff>
--- a/Homework/LLM_FactoryAutomation/산출물/허남_LLM프로젝트.docx
+++ b/Homework/LLM_FactoryAutomation/산출물/허남_LLM프로젝트.docx
@@ -19923,7 +19923,7 @@
           </w:tcPr>
           <w:p>
             <w:r>
-              <w:t>일반 RAG (순수 벡터 검색, Chroma + LangChain 체인)</w:t>
+              <w:t>Hybrid RAG (BM25 키워드 + Chroma 벡터, EnsembleRetriever 결합, v0.6)</w:t>
             </w:r>
           </w:p>
         </w:tc>
@@ -20623,7 +20623,7 @@
           </w:tcPr>
           <w:p>
             <w:r>
-              <w:t>제안 (미착수)</w:t>
+              <w:t>완료 (v0.6, 2026-07-03)</w:t>
             </w:r>
           </w:p>
         </w:tc>
@@ -20633,7 +20633,7 @@
           </w:tcPr>
           <w:p>
             <w:r>
-              <w:t>정비 문서에 '40도 초과', '1.5배 초과' 같은 정확한 수치·임계값 표현이 많아 순수 의미검색만으로는 놓칠 수 있음. BM25(키워드)+벡터를 EnsembleRetriever로 결합하면 이런 수치 질의 정확도가 오름. 2순위 이전에 선행 검토 가능한 저비용 개선안.</w:t>
+              <w:t>정비 문서에 '40도 초과', '1.5배 초과' 같은 정확한 수치·임계값 표현이 많아 순수 의미검색만으로는 놓칠 수 있음. BM25(키워드)+벡터를 EnsembleRetriever로 결합하면 이런 수치 질의 정확도가 오름. 2순위 이전에 선행 검토 가능한 저비용 개선안. [검증] "온도만 상승하면?" 질의 테스트: 적용 전 "문서에서 찾을 수 없습니다" → 적용 후 윤활 점검 근거를 정확히 찾아 답변(개선 확인).</w:t>
             </w:r>
           </w:p>
         </w:tc>
@@ -20643,7 +20643,7 @@
           </w:tcPr>
           <w:p>
             <w:r>
-              <w:t>개발~07/17, 시험~07/20, 문서~07/21</w:t>
+              <w:t>완료 (2026-07-03)</w:t>
             </w:r>
           </w:p>
         </w:tc>

</xml_diff>